<commit_message>
progress up to 29.03.2025
the progress log is valid as on 29.03.2025 21:20
</commit_message>
<xml_diff>
--- a/Metadata/Progress log.docx
+++ b/Metadata/Progress log.docx
@@ -1042,7 +1042,19 @@
         <w:rPr>
           <w:lang w:val="en-US"/>
         </w:rPr>
-        <w:t>Comments on graphs, into, autro, text styling [Shitao Zhao]</w:t>
+        <w:t xml:space="preserve">Comments on graphs, into, </w:t>
+      </w:r>
+      <w:r>
+        <w:rPr>
+          <w:lang w:val="en-US"/>
+        </w:rPr>
+        <w:t>outro</w:t>
+      </w:r>
+      <w:r>
+        <w:rPr>
+          <w:lang w:val="en-US"/>
+        </w:rPr>
+        <w:t>, text styling [Shitao Zhao]</w:t>
       </w:r>
     </w:p>
     <w:p>
@@ -1374,34 +1386,115 @@
     </w:p>
     <w:p>
       <w:pPr>
-        <w:rPr>
-          <w:lang w:val="en-US"/>
-        </w:rPr>
-      </w:pPr>
-    </w:p>
-    <w:p>
-      <w:pPr>
-        <w:rPr>
-          <w:lang w:val="en-US"/>
-        </w:rPr>
-      </w:pPr>
-      <w:r>
-        <w:rPr>
-          <w:lang w:val="en-US"/>
-        </w:rPr>
-        <w:t xml:space="preserve">### TODO: </w:t>
-      </w:r>
-      <w:r>
-        <w:rPr>
-          <w:lang w:val="en-US"/>
-        </w:rPr>
-        <w:t>final checks, SCOPING DOCUMENT</w:t>
-      </w:r>
-      <w:r>
-        <w:rPr>
-          <w:lang w:val="en-US"/>
-        </w:rPr>
-        <w:t>, RUNNING CRITERIA README</w:t>
+        <w:jc w:val="center"/>
+        <w:rPr>
+          <w:b/>
+          <w:bCs/>
+          <w:lang w:val="en-US"/>
+        </w:rPr>
+      </w:pPr>
+      <w:r>
+        <w:rPr>
+          <w:b/>
+          <w:bCs/>
+          <w:lang w:val="en-US"/>
+        </w:rPr>
+        <w:t>March 27</w:t>
+      </w:r>
+    </w:p>
+    <w:p>
+      <w:pPr>
+        <w:rPr>
+          <w:lang w:val="en-US"/>
+        </w:rPr>
+      </w:pPr>
+      <w:r>
+        <w:rPr>
+          <w:lang w:val="en-US"/>
+        </w:rPr>
+        <w:t>Scoping document [Shitao Zhao]</w:t>
+      </w:r>
+    </w:p>
+    <w:p>
+      <w:pPr>
+        <w:rPr>
+          <w:lang w:val="en-US"/>
+        </w:rPr>
+      </w:pPr>
+      <w:r>
+        <w:rPr>
+          <w:lang w:val="en-US"/>
+        </w:rPr>
+        <w:t>Presentation document</w:t>
+      </w:r>
+      <w:r>
+        <w:rPr>
+          <w:lang w:val="en-US"/>
+        </w:rPr>
+        <w:t xml:space="preserve">, requirements.txt, cosmetics, README updt </w:t>
+      </w:r>
+      <w:r>
+        <w:rPr>
+          <w:lang w:val="en-US"/>
+        </w:rPr>
+        <w:t>[Viktor Korotkov]</w:t>
+      </w:r>
+    </w:p>
+    <w:p>
+      <w:pPr>
+        <w:rPr>
+          <w:lang w:val="en-US"/>
+        </w:rPr>
+      </w:pPr>
+      <w:r>
+        <w:rPr>
+          <w:lang w:val="en-US"/>
+        </w:rPr>
+        <w:t>Zoom call, final review of the project [ALL (online)]</w:t>
+      </w:r>
+    </w:p>
+    <w:p>
+      <w:pPr>
+        <w:jc w:val="center"/>
+        <w:rPr>
+          <w:b/>
+          <w:bCs/>
+          <w:lang w:val="en-US"/>
+        </w:rPr>
+      </w:pPr>
+      <w:r>
+        <w:rPr>
+          <w:b/>
+          <w:bCs/>
+          <w:lang w:val="en-US"/>
+        </w:rPr>
+        <w:t>March 28</w:t>
+      </w:r>
+    </w:p>
+    <w:p>
+      <w:pPr>
+        <w:rPr>
+          <w:lang w:val="en-US"/>
+        </w:rPr>
+      </w:pPr>
+      <w:r>
+        <w:rPr>
+          <w:lang w:val="en-US"/>
+        </w:rPr>
+        <w:t>Some scaling changes [Viktor Korotkov]</w:t>
+      </w:r>
+    </w:p>
+    <w:p>
+      <w:pPr>
+        <w:rPr>
+          <w:lang w:val="en-US"/>
+        </w:rPr>
+      </w:pPr>
+      <w:r>
+        <w:rPr>
+          <w:lang w:val="en-US"/>
+        </w:rPr>
+        <w:t>Re-deployment #1 [Viktor Korotkov]</w:t>
       </w:r>
     </w:p>
     <w:p>
@@ -2024,7 +2117,6 @@
   <w:style w:type="character" w:default="1" w:styleId="DefaultParagraphFont">
     <w:name w:val="Default Paragraph Font"/>
     <w:uiPriority w:val="1"/>
-    <w:semiHidden/>
     <w:unhideWhenUsed/>
   </w:style>
   <w:style w:type="table" w:default="1" w:styleId="TableNormal">

</xml_diff>